<commit_message>
ajout Google Analytics OK
</commit_message>
<xml_diff>
--- a/Notice.docx
+++ b/Notice.docx
@@ -41,13 +41,29 @@
           <w:b/>
           <w:bCs/>
         </w:rPr>
-        <w:t xml:space="preserve"> 3 commandes dans Git Bash</w:t>
+        <w:t xml:space="preserve"> 3 commandes dans </w:t>
+      </w:r>
+      <w:proofErr w:type="spellStart"/>
+      <w:r>
+        <w:rPr>
+          <w:b/>
+          <w:bCs/>
+        </w:rPr>
+        <w:t>Git</w:t>
+      </w:r>
+      <w:proofErr w:type="spellEnd"/>
+      <w:r>
+        <w:rPr>
+          <w:b/>
+          <w:bCs/>
+        </w:rPr>
+        <w:t xml:space="preserve"> Bash</w:t>
       </w:r>
     </w:p>
     <w:p>
       <w:r>
         <w:pict w14:anchorId="7CA8A60A">
-          <v:rect id="_x0000_i1079" style="width:0;height:1.5pt" o:hralign="center" o:hrstd="t" o:hr="t" fillcolor="#a0a0a0" stroked="f"/>
+          <v:rect id="_x0000_i1025" style="width:0;height:1.5pt" o:hralign="center" o:hrstd="t" o:hr="t" fillcolor="#a0a0a0" stroked="f"/>
         </w:pict>
       </w:r>
     </w:p>
@@ -82,8 +98,13 @@
         <w:t>👉</w:t>
       </w:r>
       <w:r>
-        <w:t xml:space="preserve"> 1. Ouvre ton dossier SiteAuteur</w:t>
-      </w:r>
+        <w:t xml:space="preserve"> 1. Ouvre ton dossier </w:t>
+      </w:r>
+      <w:proofErr w:type="spellStart"/>
+      <w:r>
+        <w:t>SiteAuteur</w:t>
+      </w:r>
+      <w:proofErr w:type="spellEnd"/>
       <w:r>
         <w:br/>
       </w:r>
@@ -96,18 +117,36 @@
       <w:r>
         <w:t xml:space="preserve"> 2. Clic droit → </w:t>
       </w:r>
-      <w:r>
-        <w:rPr>
-          <w:b/>
-          <w:bCs/>
-        </w:rPr>
-        <w:t>Git Bash Here</w:t>
-      </w:r>
+      <w:proofErr w:type="spellStart"/>
+      <w:r>
+        <w:rPr>
+          <w:b/>
+          <w:bCs/>
+        </w:rPr>
+        <w:t>Git</w:t>
+      </w:r>
+      <w:proofErr w:type="spellEnd"/>
+      <w:r>
+        <w:rPr>
+          <w:b/>
+          <w:bCs/>
+        </w:rPr>
+        <w:t xml:space="preserve"> Bash </w:t>
+      </w:r>
+      <w:proofErr w:type="spellStart"/>
+      <w:r>
+        <w:rPr>
+          <w:b/>
+          <w:bCs/>
+        </w:rPr>
+        <w:t>Here</w:t>
+      </w:r>
+      <w:proofErr w:type="spellEnd"/>
     </w:p>
     <w:p>
       <w:r>
         <w:pict w14:anchorId="6CF6C6F0">
-          <v:rect id="_x0000_i1080" style="width:0;height:1.5pt" o:hralign="center" o:hrstd="t" o:hr="t" fillcolor="#a0a0a0" stroked="f"/>
+          <v:rect id="_x0000_i1026" style="width:0;height:1.5pt" o:hralign="center" o:hrstd="t" o:hr="t" fillcolor="#a0a0a0" stroked="f"/>
         </w:pict>
       </w:r>
     </w:p>
@@ -135,9 +174,26 @@
       </w:r>
     </w:p>
     <w:p>
-      <w:r>
-        <w:t>git add .</w:t>
-      </w:r>
+      <w:proofErr w:type="spellStart"/>
+      <w:proofErr w:type="gramStart"/>
+      <w:r>
+        <w:t>git</w:t>
+      </w:r>
+      <w:proofErr w:type="spellEnd"/>
+      <w:proofErr w:type="gramEnd"/>
+      <w:r>
+        <w:t xml:space="preserve"> </w:t>
+      </w:r>
+      <w:proofErr w:type="spellStart"/>
+      <w:proofErr w:type="gramStart"/>
+      <w:r>
+        <w:t>add</w:t>
+      </w:r>
+      <w:proofErr w:type="spellEnd"/>
+      <w:r>
+        <w:t xml:space="preserve"> .</w:t>
+      </w:r>
+      <w:proofErr w:type="gramEnd"/>
     </w:p>
     <w:p>
       <w:r>
@@ -151,8 +207,21 @@
       </w:r>
     </w:p>
     <w:p>
-      <w:r>
-        <w:t>git commit -m "modification du site"</w:t>
+      <w:proofErr w:type="spellStart"/>
+      <w:proofErr w:type="gramStart"/>
+      <w:r>
+        <w:t>git</w:t>
+      </w:r>
+      <w:proofErr w:type="spellEnd"/>
+      <w:proofErr w:type="gramEnd"/>
+      <w:r>
+        <w:t xml:space="preserve"> commit -m "modification </w:t>
+      </w:r>
+      <w:r>
+        <w:t>photo</w:t>
+      </w:r>
+      <w:r>
+        <w:t>"</w:t>
       </w:r>
     </w:p>
     <w:p>
@@ -167,14 +236,21 @@
       </w:r>
     </w:p>
     <w:p>
-      <w:r>
-        <w:t>git push</w:t>
+      <w:proofErr w:type="spellStart"/>
+      <w:proofErr w:type="gramStart"/>
+      <w:r>
+        <w:t>git</w:t>
+      </w:r>
+      <w:proofErr w:type="spellEnd"/>
+      <w:proofErr w:type="gramEnd"/>
+      <w:r>
+        <w:t xml:space="preserve"> push</w:t>
       </w:r>
     </w:p>
     <w:p>
       <w:r>
         <w:pict w14:anchorId="523AE863">
-          <v:rect id="_x0000_i1081" style="width:0;height:1.5pt" o:hralign="center" o:hrstd="t" o:hr="t" fillcolor="#a0a0a0" stroked="f"/>
+          <v:rect id="_x0000_i1027" style="width:0;height:1.5pt" o:hralign="center" o:hrstd="t" o:hr="t" fillcolor="#a0a0a0" stroked="f"/>
         </w:pict>
       </w:r>
     </w:p>
@@ -208,8 +284,28 @@
           <w:numId w:val="4"/>
         </w:numPr>
       </w:pPr>
-      <w:r>
-        <w:t xml:space="preserve">git add . → prend tes modifications </w:t>
+      <w:proofErr w:type="spellStart"/>
+      <w:proofErr w:type="gramStart"/>
+      <w:r>
+        <w:t>git</w:t>
+      </w:r>
+      <w:proofErr w:type="spellEnd"/>
+      <w:proofErr w:type="gramEnd"/>
+      <w:r>
+        <w:t xml:space="preserve"> </w:t>
+      </w:r>
+      <w:proofErr w:type="spellStart"/>
+      <w:proofErr w:type="gramStart"/>
+      <w:r>
+        <w:t>add</w:t>
+      </w:r>
+      <w:proofErr w:type="spellEnd"/>
+      <w:r>
+        <w:t xml:space="preserve"> .</w:t>
+      </w:r>
+      <w:proofErr w:type="gramEnd"/>
+      <w:r>
+        <w:t xml:space="preserve"> → prend tes modifications </w:t>
       </w:r>
     </w:p>
     <w:p>
@@ -219,8 +315,15 @@
           <w:numId w:val="4"/>
         </w:numPr>
       </w:pPr>
-      <w:r>
-        <w:t xml:space="preserve">git commit → les enregistre </w:t>
+      <w:proofErr w:type="spellStart"/>
+      <w:proofErr w:type="gramStart"/>
+      <w:r>
+        <w:t>git</w:t>
+      </w:r>
+      <w:proofErr w:type="spellEnd"/>
+      <w:proofErr w:type="gramEnd"/>
+      <w:r>
+        <w:t xml:space="preserve"> commit → les enregistre </w:t>
       </w:r>
     </w:p>
     <w:p>
@@ -230,8 +333,15 @@
           <w:numId w:val="4"/>
         </w:numPr>
       </w:pPr>
-      <w:r>
-        <w:t xml:space="preserve">git push → les envoie sur GitHub </w:t>
+      <w:proofErr w:type="spellStart"/>
+      <w:proofErr w:type="gramStart"/>
+      <w:r>
+        <w:t>git</w:t>
+      </w:r>
+      <w:proofErr w:type="spellEnd"/>
+      <w:proofErr w:type="gramEnd"/>
+      <w:r>
+        <w:t xml:space="preserve"> push → les envoie sur GitHub </w:t>
       </w:r>
     </w:p>
     <w:p>
@@ -256,18 +366,27 @@
       <w:r>
         <w:t xml:space="preserve"> </w:t>
       </w:r>
-      <w:r>
-        <w:rPr>
-          <w:b/>
-          <w:bCs/>
-        </w:rPr>
-        <w:t>Netlify met ton site à jour en ligne</w:t>
+      <w:proofErr w:type="spellStart"/>
+      <w:r>
+        <w:rPr>
+          <w:b/>
+          <w:bCs/>
+        </w:rPr>
+        <w:t>Netlify</w:t>
+      </w:r>
+      <w:proofErr w:type="spellEnd"/>
+      <w:r>
+        <w:rPr>
+          <w:b/>
+          <w:bCs/>
+        </w:rPr>
+        <w:t xml:space="preserve"> met ton site à jour en ligne</w:t>
       </w:r>
     </w:p>
     <w:p>
       <w:r>
         <w:pict w14:anchorId="38F1F9E7">
-          <v:rect id="_x0000_i1082" style="width:0;height:1.5pt" o:hralign="center" o:hrstd="t" o:hr="t" fillcolor="#a0a0a0" stroked="f"/>
+          <v:rect id="_x0000_i1028" style="width:0;height:1.5pt" o:hralign="center" o:hrstd="t" o:hr="t" fillcolor="#a0a0a0" stroked="f"/>
         </w:pict>
       </w:r>
     </w:p>
@@ -323,8 +442,13 @@
           <w:numId w:val="5"/>
         </w:numPr>
       </w:pPr>
-      <w:r>
-        <w:t xml:space="preserve">ton site est à jour </w:t>
+      <w:proofErr w:type="gramStart"/>
+      <w:r>
+        <w:t>ton</w:t>
+      </w:r>
+      <w:proofErr w:type="gramEnd"/>
+      <w:r>
+        <w:t xml:space="preserve"> site est à jour </w:t>
       </w:r>
       <w:r>
         <w:rPr>
@@ -339,7 +463,7 @@
     <w:p>
       <w:r>
         <w:pict w14:anchorId="360CE7E3">
-          <v:rect id="_x0000_i1083" style="width:0;height:1.5pt" o:hralign="center" o:hrstd="t" o:hr="t" fillcolor="#a0a0a0" stroked="f"/>
+          <v:rect id="_x0000_i1029" style="width:0;height:1.5pt" o:hralign="center" o:hrstd="t" o:hr="t" fillcolor="#a0a0a0" stroked="f"/>
         </w:pict>
       </w:r>
     </w:p>
@@ -384,8 +508,13 @@
           <w:numId w:val="6"/>
         </w:numPr>
       </w:pPr>
-      <w:r>
-        <w:t xml:space="preserve">un texte </w:t>
+      <w:proofErr w:type="gramStart"/>
+      <w:r>
+        <w:t>un</w:t>
+      </w:r>
+      <w:proofErr w:type="gramEnd"/>
+      <w:r>
+        <w:t xml:space="preserve"> texte </w:t>
       </w:r>
     </w:p>
     <w:p>
@@ -395,8 +524,13 @@
           <w:numId w:val="6"/>
         </w:numPr>
       </w:pPr>
-      <w:r>
-        <w:t xml:space="preserve">une image </w:t>
+      <w:proofErr w:type="gramStart"/>
+      <w:r>
+        <w:t>une</w:t>
+      </w:r>
+      <w:proofErr w:type="gramEnd"/>
+      <w:r>
+        <w:t xml:space="preserve"> image </w:t>
       </w:r>
     </w:p>
     <w:p>
@@ -406,8 +540,13 @@
           <w:numId w:val="6"/>
         </w:numPr>
       </w:pPr>
-      <w:r>
-        <w:t xml:space="preserve">une page livre </w:t>
+      <w:proofErr w:type="gramStart"/>
+      <w:r>
+        <w:t>une</w:t>
+      </w:r>
+      <w:proofErr w:type="gramEnd"/>
+      <w:r>
+        <w:t xml:space="preserve"> page livre </w:t>
       </w:r>
     </w:p>
     <w:p>
@@ -436,7 +575,7 @@
     <w:p>
       <w:r>
         <w:pict w14:anchorId="2828C88E">
-          <v:rect id="_x0000_i1084" style="width:0;height:1.5pt" o:hralign="center" o:hrstd="t" o:hr="t" fillcolor="#a0a0a0" stroked="f"/>
+          <v:rect id="_x0000_i1030" style="width:0;height:1.5pt" o:hralign="center" o:hrstd="t" o:hr="t" fillcolor="#a0a0a0" stroked="f"/>
         </w:pict>
       </w:r>
     </w:p>
@@ -476,16 +615,47 @@
       </w:r>
     </w:p>
     <w:p>
-      <w:r>
-        <w:t>git add .</w:t>
-      </w:r>
+      <w:proofErr w:type="spellStart"/>
+      <w:proofErr w:type="gramStart"/>
+      <w:r>
+        <w:t>git</w:t>
+      </w:r>
+      <w:proofErr w:type="spellEnd"/>
+      <w:proofErr w:type="gramEnd"/>
+      <w:r>
+        <w:t xml:space="preserve"> </w:t>
+      </w:r>
+      <w:proofErr w:type="spellStart"/>
+      <w:proofErr w:type="gramStart"/>
+      <w:r>
+        <w:t>add</w:t>
+      </w:r>
+      <w:proofErr w:type="spellEnd"/>
+      <w:r>
+        <w:t xml:space="preserve"> .</w:t>
+      </w:r>
+      <w:proofErr w:type="gramEnd"/>
       <w:r>
         <w:br/>
-        <w:t>git commit -m "..."</w:t>
+      </w:r>
+      <w:proofErr w:type="spellStart"/>
+      <w:r>
+        <w:t>git</w:t>
+      </w:r>
+      <w:proofErr w:type="spellEnd"/>
+      <w:r>
+        <w:t xml:space="preserve"> commit -m "..."</w:t>
       </w:r>
       <w:r>
         <w:br/>
-        <w:t>git push</w:t>
+      </w:r>
+      <w:proofErr w:type="spellStart"/>
+      <w:r>
+        <w:t>git</w:t>
+      </w:r>
+      <w:proofErr w:type="spellEnd"/>
+      <w:r>
+        <w:t xml:space="preserve"> push</w:t>
       </w:r>
     </w:p>
     <w:p>
@@ -502,7 +672,7 @@
     <w:p>
       <w:r>
         <w:pict w14:anchorId="3FA2C84D">
-          <v:rect id="_x0000_i1085" style="width:0;height:1.5pt" o:hralign="center" o:hrstd="t" o:hr="t" fillcolor="#a0a0a0" stroked="f"/>
+          <v:rect id="_x0000_i1031" style="width:0;height:1.5pt" o:hralign="center" o:hrstd="t" o:hr="t" fillcolor="#a0a0a0" stroked="f"/>
         </w:pict>
       </w:r>
     </w:p>
@@ -541,24 +711,40 @@
       </w:r>
     </w:p>
     <w:p>
-      <w:r>
-        <w:t>git commit -m "correction texte page accueil"</w:t>
-      </w:r>
-    </w:p>
-    <w:p>
+      <w:proofErr w:type="spellStart"/>
+      <w:proofErr w:type="gramStart"/>
+      <w:r>
+        <w:t>git</w:t>
+      </w:r>
+      <w:proofErr w:type="spellEnd"/>
+      <w:proofErr w:type="gramEnd"/>
+      <w:r>
+        <w:t xml:space="preserve"> commit -m "correction texte page accueil"</w:t>
+      </w:r>
+    </w:p>
+    <w:p>
+      <w:proofErr w:type="gramStart"/>
       <w:r>
         <w:t>ou</w:t>
       </w:r>
-    </w:p>
-    <w:p>
-      <w:r>
-        <w:t>git commit -m "ajout nouveau livre"</w:t>
+      <w:proofErr w:type="gramEnd"/>
+    </w:p>
+    <w:p>
+      <w:proofErr w:type="spellStart"/>
+      <w:proofErr w:type="gramStart"/>
+      <w:r>
+        <w:t>git</w:t>
+      </w:r>
+      <w:proofErr w:type="spellEnd"/>
+      <w:proofErr w:type="gramEnd"/>
+      <w:r>
+        <w:t xml:space="preserve"> commit -m "ajout nouveau livre"</w:t>
       </w:r>
     </w:p>
     <w:p>
       <w:r>
         <w:pict w14:anchorId="62EB0E35">
-          <v:rect id="_x0000_i1086" style="width:0;height:1.5pt" o:hralign="center" o:hrstd="t" o:hr="t" fillcolor="#a0a0a0" stroked="f"/>
+          <v:rect id="_x0000_i1032" style="width:0;height:1.5pt" o:hralign="center" o:hrstd="t" o:hr="t" fillcolor="#a0a0a0" stroked="f"/>
         </w:pict>
       </w:r>
     </w:p>
@@ -603,8 +789,13 @@
           <w:numId w:val="7"/>
         </w:numPr>
       </w:pPr>
-      <w:r>
-        <w:t xml:space="preserve">dynamique </w:t>
+      <w:proofErr w:type="gramStart"/>
+      <w:r>
+        <w:t>dynamique</w:t>
+      </w:r>
+      <w:proofErr w:type="gramEnd"/>
+      <w:r>
+        <w:t xml:space="preserve"> </w:t>
       </w:r>
       <w:r>
         <w:rPr>
@@ -623,8 +814,13 @@
           <w:numId w:val="7"/>
         </w:numPr>
       </w:pPr>
-      <w:r>
-        <w:t xml:space="preserve">modifiable facilement </w:t>
+      <w:proofErr w:type="gramStart"/>
+      <w:r>
+        <w:t>modifiable</w:t>
+      </w:r>
+      <w:proofErr w:type="gramEnd"/>
+      <w:r>
+        <w:t xml:space="preserve"> facilement </w:t>
       </w:r>
       <w:r>
         <w:rPr>
@@ -643,8 +839,13 @@
           <w:numId w:val="7"/>
         </w:numPr>
       </w:pPr>
-      <w:r>
-        <w:t xml:space="preserve">toujours à jour </w:t>
+      <w:proofErr w:type="gramStart"/>
+      <w:r>
+        <w:t>toujours</w:t>
+      </w:r>
+      <w:proofErr w:type="gramEnd"/>
+      <w:r>
+        <w:t xml:space="preserve"> à jour </w:t>
       </w:r>
       <w:r>
         <w:rPr>
@@ -659,7 +860,7 @@
     <w:p>
       <w:r>
         <w:pict w14:anchorId="6E8CF818">
-          <v:rect id="_x0000_i1087" style="width:0;height:1.5pt" o:hralign="center" o:hrstd="t" o:hr="t" fillcolor="#a0a0a0" stroked="f"/>
+          <v:rect id="_x0000_i1033" style="width:0;height:1.5pt" o:hralign="center" o:hrstd="t" o:hr="t" fillcolor="#a0a0a0" stroked="f"/>
         </w:pict>
       </w:r>
     </w:p>
@@ -2293,6 +2494,7 @@
   <w:style w:type="character" w:default="1" w:styleId="Policepardfaut">
     <w:name w:val="Default Paragraph Font"/>
     <w:uiPriority w:val="1"/>
+    <w:semiHidden/>
     <w:unhideWhenUsed/>
   </w:style>
   <w:style w:type="table" w:default="1" w:styleId="TableauNormal">

</xml_diff>